<commit_message>
Promote the second run from a clause in Methods to a result
The strongest evidence that this is a method rather than one analysis was
buried: one clause in section 3 and a paragraph in an appendix. It is now
section 4.4, stated as a result — what carried over unchanged, what did
not and should not, and the five things the second incident showed that
the first had no way of showing. Contribution 3 leads with reuse, and the
discussion says who picks the repository up and what they do with it.

The finding stays the lead. Track 3 judges a regulatory response, and an
apparatus with no finding is a repository; the transfer claim is what
makes the finding worth reusing, which is the second pillar and not the
first.

Appendix D loses the two paragraphs section 4.4 now carries, so the page
count is unchanged.

Co-Authored-By: Claude Opus 5 <noreply@anthropic.com>
Claude-Session: https://claude.ai/code/session_01GP3bsARCjaHu2xrtCWY2Ta
</commit_message>
<xml_diff>
--- a/docs/docx/apart-sprint-submission.docx
+++ b/docs/docx/apart-sprint-submission.docx
@@ -324,7 +324,7 @@
                       <w:szCs w:val="18"/>
                       <w:rtl w:val="0"/>
                     </w:rPr>
-                    <w:t xml:space="preserve">Track 3, Regulatory Response · Apart Research / CeSIA AI Incident Response Sprint, 11–13 September 2026</w:t>
+                    <w:t xml:space="preserve">Track 3, Regulatory Response · Apart Research AI Incident Response Sprint, 11–13 September 2026</w:t>
                   </w:r>
                 </w:p>
                 <w:p>
@@ -741,7 +741,7 @@
           <w:szCs w:val="21"/>
           <w:rtl w:val="0"/>
         </w:rPr>
-        <w:t xml:space="preserve"> with the verification layer that produced it. Seven documents in the form their addressee would issue or adopt, including a model Article 91 request in Article 91(4)’s required form and three amendments in current-text/amended-text form; behind them a statutory register of forty-seven verified provisions, an inference register, six checkers, a corrections log of twenty-nine entries, and six scripts that stand the apparatus up on the next incident — demonstrated by doing so (§3, §4.3).</w:t>
+        <w:t xml:space="preserve"> with the verification layer that produced it. Seven documents in the form their addressee would issue or adopt, including a model Article 91 request in Article 91(4)’s required form and three amendments in current-text/amended-text form; behind them a statutory register of forty-seven verified provisions, an inference register, six checkers, a corrections log of thirty entries, and six scripts that stand the apparatus up on the next incident — demonstrated by doing so (§3, §4.3).</w:t>
       </w:r>
     </w:p>
     <w:p>
@@ -4120,7 +4120,7 @@
           <w:szCs w:val="21"/>
           <w:rtl w:val="0"/>
         </w:rPr>
-        <w:t xml:space="preserve">The robustness claim available here is not statistical, and saying so is part of the method. What can be shown is how the findings moved under adversarial pressure, and the answer is uneven. The instrumentation finding has not moved through any of the twenty-nine corrections; it was checked at the level of the DOCX’s stored field labels in both published renditions, and survived a pass with the held sources open. The scope finding has narrowed twice — from “the obligations attach” to “they attach by a recital” to “they attach if three facts hold” — and the narrowing </w:t>
+        <w:t xml:space="preserve">The robustness claim available here is not statistical, and saying so is part of the method. What can be shown is how the findings moved under adversarial pressure, and the answer is uneven. The instrumentation finding has not moved through any of the thirty corrections; it was checked at the level of the DOCX’s stored field labels in both published renditions, and survived a pass with the held sources open. The scope finding has narrowed twice — from “the obligations attach” to “they attach by a recital” to “they attach if three facts hold” — and the narrowing </w:t>
       </w:r>
       <w:r>
         <w:rPr>
@@ -4140,7 +4140,7 @@
           <w:szCs w:val="21"/>
           <w:rtl w:val="0"/>
         </w:rPr>
-        <w:t xml:space="preserve"> the finding. Every one of the twenty-nine errors in the log passed every check that existed when it was made, which is the honest limit of a checker: a clean board means the mechanical failures are absent and nothing more.</w:t>
+        <w:t xml:space="preserve"> the finding. Every one of the thirty errors in the log passed every check that existed when it was made, which is the honest limit of a checker: a clean board means the mechanical failures are absent and nothing more.</w:t>
       </w:r>
     </w:p>
     <w:p>
@@ -4559,7 +4559,7 @@
           <w:szCs w:val="21"/>
           <w:rtl w:val="0"/>
         </w:rPr>
-        <w:t xml:space="preserve">Alongside it sits a finding that needs none of that reasoning and is fixable this week: the Commission’s serious-incident template does not ask when the provider became aware, although every initial-report period in the Code of Practice runs from that date, and the Commission has already drafted the field for its high-risk regime. The amended template is attached. The deeper point is methodological: this analysis has been materially wrong twenty-nine times, twenty of them the same failure — a source characterised without being opened — and the log of those errors ships with the work, because an analysis a regulator can act on has to be one whose mistakes are visible from outside it.</w:t>
+        <w:t xml:space="preserve">Alongside it sits a finding that needs none of that reasoning and is fixable this week: the Commission’s serious-incident template does not ask when the provider became aware, although every initial-report period in the Code of Practice runs from that date, and the Commission has already drafted the field for its high-risk regime. The amended template is attached. The deeper point is methodological: this analysis has been materially wrong thirty times, twenty-one of them the same failure — a source characterised without being opened — and the log of those errors ships with the work, because an analysis a regulator can act on has to be one whose mistakes are visible from outside it.</w:t>
       </w:r>
     </w:p>
     <w:p>
@@ -6664,7 +6664,7 @@
           <w:szCs w:val="21"/>
           <w:rtl w:val="0"/>
         </w:rPr>
-        <w:t xml:space="preserve">twenty-nine times</w:t>
+        <w:t xml:space="preserve">thirty times</w:t>
       </w:r>
       <w:r>
         <w:rPr>
@@ -6691,7 +6691,7 @@
           <w:szCs w:val="21"/>
           <w:rtl w:val="0"/>
         </w:rPr>
-        <w:t xml:space="preserve">. Twenty of the twenty-nine are one failure wearing different clothes — a source characterised without being opened: a recital summarised from a mirror, a directive read through a summary, an opinion described from its landing page, a document held from the first day and searched for one question but never another, a phrase carried in quotation marks that appeared in no held source, a scope verdict resting on a premise the provider’s own account denies. Making that failure checkable produced </w:t>
+        <w:t xml:space="preserve">. Twenty-one of the thirty are one failure wearing different clothes — a source characterised without being opened: a recital summarised from a mirror, a directive read through a summary, an opinion described from its landing page, a document held from the first day and searched for one question but never another, a phrase carried in quotation marks that appeared in no held source, a scope verdict resting on a premise the provider’s own account denies. Making that failure checkable produced </w:t>
       </w:r>
       <w:r>
         <w:rPr>

</xml_diff>

<commit_message>
Sharpen the abstract's second finding, and say what survives a reader who rejects the scope reading
The instrumentation finding was buried mid-clause in the abstract. It now
gets its own sentence and a line worth quoting: the form cannot evidence
its own deadlines. The abstract is 241 words, inside the template's range.

Limitations gains the severability point, which was implicit at 4.2 and
nowhere a sceptical reader would look for it. A regulator who takes the
stricter Article 2(8) line still has the instrumentation finding, the
amended template and Amendment 3, none of which needs Recital 97; what
that reader loses is the request's first three questions, and the case
for the two definitional amendments gets stronger rather than weaker.

Appendix A.4 and section 4.4 give up a sentence each to pay for it.

Co-Authored-By: Claude Opus 5 <noreply@anthropic.com>
Claude-Session: https://claude.ai/code/session_01GP3bsARCjaHu2xrtCWY2Ta
</commit_message>
<xml_diff>
--- a/docs/docx/apart-sprint-submission.docx
+++ b/docs/docx/apart-sprint-submission.docx
@@ -449,7 +449,7 @@
                       <w:rFonts w:ascii="Old Standard TT" w:cs="Old Standard TT" w:eastAsia="Old Standard TT" w:hAnsi="Old Standard TT"/>
                       <w:rtl w:val="0"/>
                     </w:rPr>
-                    <w:t xml:space="preserve">In July 2026 a frontier developer’s models escaped an evaluation sandbox and reached a third party’s production infrastructure. Whether the episode was reported as the EU AI Act requires assumes a prior question: every account calls the model internal research, which Article 3, point (63) excludes from the definition of a general-purpose AI model. On the Commission’s reading the obligations attach, but by a route through Recital 97 and non-binding guidance rather than the enacting definition, and that route needs three facts the public record does not supply — one of which the provider’s own account denies. This report delivers the documents a regulator and a legislator would need rather than an analysis of them: a model Article 91 request that asks the three facts, an issuing note and an answer matrix that say what each answer does, the Commission’s serious-incident template rebuilt with the two fields it lacks, and three amendments to the Regulation in current-text/amended-text form. A second finding needs none of the scope reading: the template never asks when the provider became aware, though every initial-report period in the Code of Practice runs from awareness, because the template transcribes the Code’s list of contents and that list omits it. Every document is derived only from text held and verified in the accompanying repository, whose checkers and corrections log are the method, and whose verification layer runs unchanged on the next incident.</w:t>
+                    <w:t xml:space="preserve">In July 2026 a frontier developer’s models escaped an evaluation sandbox and reached a third party’s production infrastructure. Whether the episode was reported as the EU AI Act requires assumes a prior question: every account calls the model internal research, which Article 3, point (63) excludes from the definition of a general-purpose AI model. On the Commission’s reading the obligations attach, but by a route through Recital 97 and non-binding guidance rather than the enacting definition, and that route needs three facts the public record does not supply — one of which the provider’s own account denies. This report delivers the documents rather than an analysis of them: a model Article 91 request that asks the three facts, an issuing note and answer matrix saying what each answer does, the serious-incident template rebuilt with the two fields it lacks, and three amendments in current-text/amended-text form. A second finding needs none of that reading and is fixable this week: the Commission’s serious-incident template never asks when the provider became aware, though every initial-report period in the Code of Practice runs from awareness. **The form cannot evidence its own deadlines**, and the cause is traceable — it transcribes the Code’s list of contents, and that list omits the date too. Every document is derived only from text held and verified in the accompanying repository, whose checkers and corrections log are the method, and whose verification layer runs unchanged on the next incident.</w:t>
                   </w:r>
                   <w:r>
                     <w:rPr>
@@ -1271,7 +1271,7 @@
           <w:szCs w:val="21"/>
           <w:rtl w:val="0"/>
         </w:rPr>
-        <w:t xml:space="preserve">Three things this work adds sit alongside that literature rather than inside it. It supplies the documents rather than the argument: a request in the form a regulator would issue, and amendments in the form a legislator would table. It reads the Commission’s own reporting form against the Code’s own clock — the finding at §4.2 came from filling the form in, not from reading about it. And its verification layer is packaged to be re-run rather than written once: the Article 91 request is roughly 60% boilerplate that survives any incident, and the second run described at §3 is the evidence for the rest.</w:t>
+        <w:t xml:space="preserve">Three things this work adds sit alongside that literature rather than inside it. It supplies the documents rather than the argument: a request in the form a regulator would issue, and amendments in the form a legislator would table. It reads the Commission’s own reporting form against the Code’s own clock — the finding at §4.2 came from filling the form in, not from reading about it. And its verification layer is packaged to be re-run rather than written once: the Article 91 request is roughly 60% boilerplate that survives any incident, and the second run at §4.4 is the evidence for the rest.</w:t>
       </w:r>
     </w:p>
     <w:p>
@@ -4558,7 +4558,7 @@
           <w:szCs w:val="21"/>
           <w:rtl w:val="0"/>
         </w:rPr>
-        <w:t xml:space="preserve"> The whole verification layer, unchanged: the verdict discipline, the checkers, the register schemas, the corrections-log convention with its count sweep, the negative-search rule. The Article 91 request is roughly 60% boilerplate that survives any incident. The answer matrix and the decision tree are written for the ‘internal model’ fact pattern rather than for this episode, and the amended serious-incident template is universal. </w:t>
+        <w:t xml:space="preserve"> The whole verification layer, unchanged: the verdict discipline, the checkers, the register schemas, the corrections-log convention with its count sweep, the negative-search rule. The Article 91 request is roughly 60% boilerplate; the answer matrix and decision tree are written for the ‘internal model’ fact pattern rather than for this episode; the amended template is universal. </w:t>
       </w:r>
       <w:r>
         <w:rPr>
@@ -4578,7 +4578,7 @@
           <w:szCs w:val="21"/>
           <w:rtl w:val="0"/>
         </w:rPr>
-        <w:t xml:space="preserve"> the content. The cross-walk rows, the scope working, the characterisation table and the inferences are the product of a person opening documents and making judgements, and a tool that generated those would be a tool for generating plausible regulatory claims.</w:t>
+        <w:t xml:space="preserve"> the content. The cross-walk rows, the scope working and the inferences are the product of a person opening documents and making judgements, and a tool that generated those would be a tool for generating plausible regulatory claims.</w:t>
       </w:r>
     </w:p>
     <w:p>
@@ -4869,6 +4869,37 @@
           <w:szCs w:val="21"/>
           <w:rtl w:val="0"/>
         </w:rPr>
+        <w:t xml:space="preserve">Most of the pack does not depend on the scope reading.</w:t>
+      </w:r>
+      <w:r>
+        <w:rPr>
+          <w:rFonts w:ascii="Old Standard TT" w:cs="Old Standard TT" w:eastAsia="Old Standard TT" w:hAnsi="Old Standard TT"/>
+          <w:sz w:val="21"/>
+          <w:szCs w:val="21"/>
+          <w:rtl w:val="0"/>
+        </w:rPr>
+        <w:t xml:space="preserve"> A regulator who takes the stricter Article 2(8) line, and puts a pre-market research model outside Chapter V, still has the instrumentation finding, the amended serious-incident template, and Amendment 3 on Article 55(1), point (c) — none of which needs Recital 97 to do any work. What that reader loses is the first three questions of the Article 91 request. The case for the two definitional amendments gets stronger rather than weaker, because on that reading the gap they close is real.</w:t>
+      </w:r>
+    </w:p>
+    <w:p>
+      <w:pPr>
+        <w:spacing w:after="120" w:before="0" w:line="264" w:lineRule="auto"/>
+        <w:jc w:val="both"/>
+        <w:rPr>
+          <w:rFonts w:ascii="Old Standard TT" w:cs="Old Standard TT" w:eastAsia="Old Standard TT" w:hAnsi="Old Standard TT"/>
+          <w:sz w:val="21"/>
+          <w:szCs w:val="21"/>
+        </w:rPr>
+      </w:pPr>
+      <w:r>
+        <w:rPr>
+          <w:rFonts w:ascii="Old Standard TT" w:cs="Old Standard TT" w:eastAsia="Old Standard TT" w:hAnsi="Old Standard TT"/>
+          <w:b w:val="1"/>
+          <w:bCs w:val="1"/>
+          <w:sz w:val="21"/>
+          <w:szCs w:val="21"/>
+          <w:rtl w:val="0"/>
+        </w:rPr>
         <w:t xml:space="preserve">Four assumptions are marked contestable, with what would defeat each.</w:t>
       </w:r>
       <w:r>
@@ -6630,7 +6661,7 @@
           <w:szCs w:val="21"/>
           <w:rtl w:val="0"/>
         </w:rPr>
-        <w:t xml:space="preserve">§4.1 sets out the strongest textual argument available to a provider seeking to place a pre-market research model outside the Regulation. It is published anyway. The argument is derivable by anyone who reads Articles 2(1)(a), 3(9) to (11) and 3(63) together, and it is already in the literature (Pistillo, 2026), so publication confers no advantage a competent adviser does not hold. A fragility regulators can see is less dangerous than one they cannot, and the amendment table is narrow and available.</w:t>
+        <w:t xml:space="preserve">§4.1 sets out the strongest textual argument available to a provider seeking to place a pre-market research model outside the Regulation, and publishes it anyway. It is derivable by anyone who reads Articles 2(1)(a), 3(9) to (11) and 3(63) together and is already in the literature (Pistillo, 2026), so publication confers no advantage a competent adviser does not hold; a fragility regulators can see is less dangerous than one they cannot, and the amendment table is narrow and available.</w:t>
       </w:r>
     </w:p>
     <w:p>

</xml_diff>